<commit_message>
docs: sync README user flow into beginner Word manual
</commit_message>
<xml_diff>
--- a/计算机学习方向卡 零基础使用与功能说明书.docx
+++ b/计算机学习方向卡 零基础使用与功能说明书.docx
@@ -1242,6 +1242,42 @@
           <w:t>确认窗口与展开区速查</w:t>
           <w:tab/>
           <w:t>28</w:t>
+        </w:r>
+      </w:hyperlink>
+    </w:p>
+    <w:p>
+      <w:pPr>
+        <w:tabs>
+          <w:tab w:pos="9354" w:val="right" w:leader="dot"/>
+        </w:tabs>
+        <w:spacing w:after="20" w:line="240" w:lineRule="exact"/>
+      </w:pPr>
+      <w:hyperlink w:anchor="user_flow_29">
+        <w:r>
+          <w:rPr>
+            <w:sz w:val="18"/>
+          </w:rPr>
+          <w:t>用户使用流程图  从认识方向到开始实践</w:t>
+          <w:tab/>
+          <w:t>29</w:t>
+        </w:r>
+      </w:hyperlink>
+    </w:p>
+    <w:p>
+      <w:pPr>
+        <w:tabs>
+          <w:tab w:pos="9354" w:val="right" w:leader="dot"/>
+        </w:tabs>
+        <w:spacing w:after="20" w:line="240" w:lineRule="exact"/>
+      </w:pPr>
+      <w:hyperlink w:anchor="user_flow_30">
+        <w:r>
+          <w:rPr>
+            <w:sz w:val="18"/>
+          </w:rPr>
+          <w:t>用户使用流程图  实践后回顾与调整</w:t>
+          <w:tab/>
+          <w:t>30</w:t>
         </w:r>
       </w:hyperlink>
     </w:p>
@@ -17522,6 +17558,208 @@
         <w:snapToGrid w:val="0"/>
       </w:pPr>
     </w:p>
+    <w:p>
+      <w:r>
+        <w:br w:type="page"/>
+      </w:r>
+    </w:p>
+    <w:p>
+      <w:pPr>
+        <w:spacing w:after="60" w:line="264" w:lineRule="auto"/>
+      </w:pPr>
+      <w:r>
+        <w:rPr>
+          <w:rFonts w:ascii="Microsoft YaHei" w:hAnsi="Microsoft YaHei" w:eastAsia="Microsoft YaHei"/>
+          <w:color w:val="000000"/>
+          <w:sz w:val="18"/>
+        </w:rPr>
+        <w:t>附录  用户使用流程图</w:t>
+      </w:r>
+    </w:p>
+    <w:p>
+      <w:bookmarkStart w:id="291" w:name="user_flow_29"/>
+      <w:pPr>
+        <w:pStyle w:val="Heading1"/>
+        <w:pageBreakBefore w:val="0"/>
+        <w:spacing w:after="120" w:line="264" w:lineRule="auto"/>
+      </w:pPr>
+      <w:r>
+        <w:rPr>
+          <w:rFonts w:ascii="Microsoft YaHei" w:hAnsi="Microsoft YaHei" w:eastAsia="Microsoft YaHei"/>
+          <w:color w:val="000000"/>
+          <w:sz w:val="38"/>
+        </w:rPr>
+        <w:t>从认识方向到开始实践</w:t>
+      </w:r>
+      <w:bookmarkEnd w:id="291"/>
+    </w:p>
+    <w:p>
+      <w:pPr>
+        <w:spacing w:after="80" w:line="264" w:lineRule="auto"/>
+      </w:pPr>
+      <w:r>
+        <w:rPr>
+          <w:rFonts w:ascii="Microsoft YaHei" w:hAnsi="Microsoft YaHei" w:eastAsia="Microsoft YaHei"/>
+          <w:color w:val="000000"/>
+          <w:sz w:val="18"/>
+        </w:rPr>
+        <w:t>从上往下阅读；已有明确目标时，可直接选择领域或专题。没有 API Key，也能完成核心流程。</w:t>
+      </w:r>
+    </w:p>
+    <w:p>
+      <w:pPr>
+        <w:spacing w:after="60" w:line="240" w:lineRule="auto"/>
+        <w:jc w:val="center"/>
+      </w:pPr>
+      <w:r>
+        <w:drawing>
+          <wp:inline xmlns:a="http://schemas.openxmlformats.org/drawingml/2006/main" xmlns:pic="http://schemas.openxmlformats.org/drawingml/2006/picture">
+            <wp:extent cx="4522779" cy="7560000"/>
+            <wp:docPr id="2" name="Picture 2" descr="开始使用方向卡&#10;探索方向&#10;认识专业、领域和专题&#10;梳理学习起点&#10;填写背景、兴趣与现实条件&#10;核对已有知识&#10;不确定的内容可以保留为未知&#10;预览并确认知识画像&#10;查看探索结果&#10;分别了解探索优先级、准备程度与证据充分度&#10;选择想尝试的领域或专题&#10;必要时比较方向&#10;查看迁移路线&#10;了解可复用基础、待验证知识与学习缺口&#10;比较候选路线&#10;选择后保存，并明确启用一条计划&#10;进入学习工作台&#10;完成当前一步小实践&#10;记录结果、困难和实践证据&#10;结合周反馈回顾体验&#10;做完这次实践，&#10;你有什么发现？&#10;核对证据&#10;预览并确认知识变化&#10;查看路线差异&#10;自行决定是否采用新路线，保留旧版本&#10;可选：学习顾问&#10;使用本地模板，或启用 DeepSeek / ChatGPT&#10;可选择快速检索或四平台对照&#10;已有明确目标&#10;这个方向值得继续，我想接着学&#10;我对自己的基础有了新认识&#10;我还想看看其他方向&#10;辅助理解与比较&#10;辅助解释路线"/>
+            <wp:cNvGraphicFramePr>
+              <a:graphicFrameLocks noChangeAspect="1"/>
+            </wp:cNvGraphicFramePr>
+            <a:graphic>
+              <a:graphicData uri="http://schemas.openxmlformats.org/drawingml/2006/picture">
+                <pic:pic>
+                  <pic:nvPicPr>
+                    <pic:cNvPr id="0" name="flow-1.png"/>
+                    <pic:cNvPicPr/>
+                  </pic:nvPicPr>
+                  <pic:blipFill>
+                    <a:blip r:embed="rId12"/>
+                    <a:stretch>
+                      <a:fillRect/>
+                    </a:stretch>
+                  </pic:blipFill>
+                  <pic:spPr>
+                    <a:xfrm>
+                      <a:off x="0" y="0"/>
+                      <a:ext cx="4522779" cy="7560000"/>
+                    </a:xfrm>
+                    <a:prstGeom prst="rect"/>
+                  </pic:spPr>
+                </pic:pic>
+              </a:graphicData>
+            </a:graphic>
+          </wp:inline>
+        </w:drawing>
+      </w:r>
+    </w:p>
+    <w:p>
+      <w:pPr>
+        <w:spacing w:after="0" w:line="264" w:lineRule="auto"/>
+      </w:pPr>
+      <w:r>
+        <w:rPr>
+          <w:rFonts w:ascii="Microsoft YaHei" w:hAnsi="Microsoft YaHei" w:eastAsia="Microsoft YaHei"/>
+          <w:color w:val="000000"/>
+          <w:sz w:val="18"/>
+        </w:rPr>
+        <w:t>实线表示主要操作；虚线表示快捷入口或可选顾问辅助。完成小实践后，接着阅读下一页。</w:t>
+      </w:r>
+    </w:p>
+    <w:p>
+      <w:r>
+        <w:br w:type="page"/>
+      </w:r>
+    </w:p>
+    <w:p>
+      <w:pPr>
+        <w:spacing w:after="60" w:line="264" w:lineRule="auto"/>
+      </w:pPr>
+      <w:r>
+        <w:rPr>
+          <w:rFonts w:ascii="Microsoft YaHei" w:hAnsi="Microsoft YaHei" w:eastAsia="Microsoft YaHei"/>
+          <w:color w:val="000000"/>
+          <w:sz w:val="18"/>
+        </w:rPr>
+        <w:t>附录  用户使用流程图</w:t>
+      </w:r>
+    </w:p>
+    <w:p>
+      <w:bookmarkStart w:id="292" w:name="user_flow_30"/>
+      <w:pPr>
+        <w:pStyle w:val="Heading1"/>
+        <w:pageBreakBefore w:val="0"/>
+        <w:spacing w:after="120" w:line="264" w:lineRule="auto"/>
+      </w:pPr>
+      <w:r>
+        <w:rPr>
+          <w:rFonts w:ascii="Microsoft YaHei" w:hAnsi="Microsoft YaHei" w:eastAsia="Microsoft YaHei"/>
+          <w:color w:val="000000"/>
+          <w:sz w:val="38"/>
+        </w:rPr>
+        <w:t>实践后回顾与调整</w:t>
+      </w:r>
+      <w:bookmarkEnd w:id="292"/>
+    </w:p>
+    <w:p>
+      <w:pPr>
+        <w:spacing w:after="80" w:line="264" w:lineRule="auto"/>
+      </w:pPr>
+      <w:r>
+        <w:rPr>
+          <w:rFonts w:ascii="Microsoft YaHei" w:hAnsi="Microsoft YaHei" w:eastAsia="Microsoft YaHei"/>
+          <w:color w:val="000000"/>
+          <w:sz w:val="18"/>
+        </w:rPr>
+        <w:t>从“进入学习工作台”开始回顾；想换方向时，沿箭头返回上方重新选择，并再次查看路线。</w:t>
+      </w:r>
+    </w:p>
+    <w:p>
+      <w:pPr>
+        <w:spacing w:after="60" w:line="240" w:lineRule="auto"/>
+        <w:jc w:val="center"/>
+      </w:pPr>
+      <w:r>
+        <w:drawing>
+          <wp:inline xmlns:a="http://schemas.openxmlformats.org/drawingml/2006/main" xmlns:pic="http://schemas.openxmlformats.org/drawingml/2006/picture">
+            <wp:extent cx="4297940" cy="7560000"/>
+            <wp:docPr id="3" name="Picture 3" descr="开始使用方向卡&#10;探索方向&#10;认识专业、领域和专题&#10;梳理学习起点&#10;填写背景、兴趣与现实条件&#10;核对已有知识&#10;不确定的内容可以保留为未知&#10;预览并确认知识画像&#10;查看探索结果&#10;分别了解探索优先级、准备程度与证据充分度&#10;选择想尝试的领域或专题&#10;必要时比较方向&#10;查看迁移路线&#10;了解可复用基础、待验证知识与学习缺口&#10;比较候选路线&#10;选择后保存，并明确启用一条计划&#10;进入学习工作台&#10;完成当前一步小实践&#10;记录结果、困难和实践证据&#10;结合周反馈回顾体验&#10;做完这次实践，&#10;你有什么发现？&#10;核对证据&#10;预览并确认知识变化&#10;查看路线差异&#10;自行决定是否采用新路线，保留旧版本&#10;可选：学习顾问&#10;使用本地模板，或启用 DeepSeek / ChatGPT&#10;可选择快速检索或四平台对照&#10;已有明确目标&#10;这个方向值得继续，我想接着学&#10;我对自己的基础有了新认识&#10;我还想看看其他方向&#10;辅助理解与比较&#10;辅助解释路线"/>
+            <wp:cNvGraphicFramePr>
+              <a:graphicFrameLocks noChangeAspect="1"/>
+            </wp:cNvGraphicFramePr>
+            <a:graphic>
+              <a:graphicData uri="http://schemas.openxmlformats.org/drawingml/2006/picture">
+                <pic:pic>
+                  <pic:nvPicPr>
+                    <pic:cNvPr id="0" name="flow-2.png"/>
+                    <pic:cNvPicPr/>
+                  </pic:nvPicPr>
+                  <pic:blipFill>
+                    <a:blip r:embed="rId13"/>
+                    <a:stretch>
+                      <a:fillRect/>
+                    </a:stretch>
+                  </pic:blipFill>
+                  <pic:spPr>
+                    <a:xfrm>
+                      <a:off x="0" y="0"/>
+                      <a:ext cx="4297940" cy="7560000"/>
+                    </a:xfrm>
+                    <a:prstGeom prst="rect"/>
+                  </pic:spPr>
+                </pic:pic>
+              </a:graphicData>
+            </a:graphic>
+          </wp:inline>
+        </w:drawing>
+      </w:r>
+    </w:p>
+    <w:p>
+      <w:pPr>
+        <w:spacing w:after="0" w:line="264" w:lineRule="auto"/>
+      </w:pPr>
+      <w:r>
+        <w:rPr>
+          <w:rFonts w:ascii="Microsoft YaHei" w:hAnsi="Microsoft YaHei" w:eastAsia="Microsoft YaHei"/>
+          <w:color w:val="000000"/>
+          <w:sz w:val="18"/>
+        </w:rPr>
+        <w:t>三个分支可以先后进行，例如先更新知识记录，再继续实践。知识变化与采用新路线分别确认，旧路线保留。</w:t>
+      </w:r>
+    </w:p>
     <w:sectPr>
       <w:footerReference w:type="default" r:id="rId9"/>
       <w:pgSz w:w="11906" w:h="16838"/>

</xml_diff>